<commit_message>
release 1.8.2: carga rápida da lista de processos + SERASAJUD (nome ou nomes)
- carga da aba Pesquisa via índice de resumo persistido (mtime incremental) +
  carga preguiçosa do Processo completo: ~6,4s -> ~0,6s nas aberturas seguintes
  (novo organizador/indice_processos.py; ajustes em gui.py/pesquisa.py/config.py)
- SERASAJUD: "(nome ou nomes)" passa a resolver para "nome"/"nomes" pelo número
  de réus (não vira mais o nome da parte); marca-texto do modelo some na geração
- testes: tests/test_indice_processos.py + ajustes em test_peticoes/test_pesquisa
- inclui atualização de data literal no template SERASAJUD.docx (irrelevante à
  saída — a data de fecho é sempre reescrita para a data de emissão)

Co-Authored-By: Claude Opus 4.8 (1M context) <noreply@anthropic.com>
</commit_message>
<xml_diff>
--- a/Petições/Penhora/SERASAJUD.docx
+++ b/Petições/Penhora/SERASAJUD.docx
@@ -17,8 +17,6 @@
           <w:szCs w:val="22"/>
         </w:rPr>
       </w:pPr>
-      <w:bookmarkStart w:id="0" w:name="_GoBack"/>
-      <w:bookmarkEnd w:id="0"/>
       <w:r>
         <w:rPr>
           <w:rFonts w:ascii="Calibri" w:hAnsi="Calibri" w:cs="Calibri,Bold"/>
@@ -537,7 +535,7 @@
           <w:rFonts w:ascii="Calibri" w:hAnsi="Calibri" w:cs="Calibri"/>
           <w:sz w:val="24"/>
           <w:szCs w:val="22"/>
-          <w:highlight w:val="yellow"/>
+          <w:highlight w:val="magenta"/>
         </w:rPr>
         <w:t>(do ou dos) (nome ou nomes) (</w:t>
       </w:r>
@@ -546,7 +544,7 @@
           <w:rFonts w:ascii="Calibri" w:hAnsi="Calibri" w:cs="Calibri"/>
           <w:sz w:val="24"/>
           <w:szCs w:val="22"/>
-          <w:highlight w:val="yellow"/>
+          <w:highlight w:val="magenta"/>
         </w:rPr>
         <w:t xml:space="preserve">da ou das ou </w:t>
       </w:r>
@@ -555,7 +553,7 @@
           <w:rFonts w:ascii="Calibri" w:hAnsi="Calibri" w:cs="Calibri"/>
           <w:sz w:val="24"/>
           <w:szCs w:val="22"/>
-          <w:highlight w:val="yellow"/>
+          <w:highlight w:val="magenta"/>
         </w:rPr>
         <w:t>do ou dos) (executado ou executados</w:t>
       </w:r>
@@ -564,7 +562,7 @@
           <w:rFonts w:ascii="Calibri" w:hAnsi="Calibri" w:cs="Calibri"/>
           <w:sz w:val="24"/>
           <w:szCs w:val="22"/>
-          <w:highlight w:val="yellow"/>
+          <w:highlight w:val="magenta"/>
         </w:rPr>
         <w:t xml:space="preserve"> ou executada ou executadas</w:t>
       </w:r>
@@ -573,7 +571,7 @@
           <w:rFonts w:ascii="Calibri" w:hAnsi="Calibri" w:cs="Calibri"/>
           <w:sz w:val="24"/>
           <w:szCs w:val="22"/>
-          <w:highlight w:val="yellow"/>
+          <w:highlight w:val="magenta"/>
         </w:rPr>
         <w:t>)</w:t>
       </w:r>
@@ -592,7 +590,18 @@
           <w:sz w:val="24"/>
           <w:szCs w:val="22"/>
         </w:rPr>
-        <w:t>SERASAJUD</w:t>
+        <w:t>S</w:t>
+      </w:r>
+      <w:bookmarkStart w:id="0" w:name="_GoBack"/>
+      <w:bookmarkEnd w:id="0"/>
+      <w:r>
+        <w:rPr>
+          <w:rFonts w:ascii="Calibri" w:hAnsi="Calibri" w:cs="Calibri"/>
+          <w:b/>
+          <w:sz w:val="24"/>
+          <w:szCs w:val="22"/>
+        </w:rPr>
+        <w:t>ERASAJUD</w:t>
       </w:r>
       <w:r>
         <w:rPr>
@@ -722,7 +731,7 @@
           <w:sz w:val="24"/>
           <w:szCs w:val="22"/>
         </w:rPr>
-        <w:t>22 de julho de 2026</w:t>
+        <w:t>30 de julho de 2026</w:t>
       </w:r>
       <w:r>
         <w:rPr>
@@ -1018,7 +1027,7 @@
           <v:path o:extrusionok="f" gradientshapeok="t" o:connecttype="rect"/>
           <o:lock v:ext="edit" aspectratio="t"/>
         </v:shapetype>
-        <v:shape id="Picture 1" o:spid="_x0000_s2056" type="#_x0000_t75" style="position:absolute;left:0;text-align:left;margin-left:.2pt;margin-top:-11pt;width:594.6pt;height:858pt;z-index:-251658752;visibility:visible;mso-position-horizontal-relative:page;mso-position-vertical-relative:page">
+        <v:shape id="Picture 1" o:spid="_x0000_s2056" type="#_x0000_t75" style="position:absolute;left:0;text-align:left;margin-left:.2pt;margin-top:-11pt;width:594.6pt;height:858pt;z-index:-1;visibility:visible;mso-position-horizontal-relative:page;mso-position-vertical-relative:page">
           <v:imagedata r:id="rId1" o:title=""/>
           <w10:wrap anchorx="page" anchory="page"/>
         </v:shape>
@@ -1745,6 +1754,7 @@
   <w:style w:type="character" w:default="1" w:styleId="Fontepargpadro">
     <w:name w:val="Default Paragraph Font"/>
     <w:uiPriority w:val="1"/>
+    <w:semiHidden/>
     <w:unhideWhenUsed/>
   </w:style>
   <w:style w:type="table" w:default="1" w:styleId="Tabelanormal">
@@ -1752,7 +1762,6 @@
     <w:uiPriority w:val="99"/>
     <w:semiHidden/>
     <w:unhideWhenUsed/>
-    <w:qFormat/>
     <w:tblPr>
       <w:tblInd w:w="0" w:type="dxa"/>
       <w:tblCellMar>

</xml_diff>